<commit_message>
Reframe individual-first holding: Korean FX/tax rationale + documentation guardrails
One-pager risk line 2 now reads as a transitional-holding arrangement
requiring documentation (written nominee declaration, deadline transfer
into the holdco at the same valuation, written Korean tax opinion) with
all shareholders ultimately entering pro rata as a block. Director
briefing gains a 'Korean FX/tax rationale' subsection comparing the
three compliant paths (direct swap / holdco block entry (recommended) /
documented individual-first bridge) and softens the draft-MOU critique
to acknowledge the legitimate FX/tax motive.

Co-Authored-By: Claude Fable 5 <noreply@anthropic.com>
Claude-Session: https://claude.ai/code/session_01AQEsBRx3YjneicK8t6qK39
</commit_message>
<xml_diff>
--- a/synexo/GenApep_Director_Briefing.docx
+++ b/synexo/GenApep_Director_Briefing.docx
@@ -1277,6 +1277,229 @@
     </w:p>
     <w:p>
       <w:pPr>
+        <w:pStyle w:val="Heading3"/>
+      </w:pPr>
+      <w:r>
+        <w:t>Korean FX/tax rationale — choosing the compliant path</w:t>
+      </w:r>
+    </w:p>
+    <w:p>
+      <w:pPr>
+        <w:spacing w:after="120"/>
+      </w:pPr>
+      <w:r>
+        <w:rPr>
+          <w:b w:val="0"/>
+          <w:i w:val="0"/>
+          <w:sz w:val="21"/>
+        </w:rPr>
+        <w:t>The idea of issuing shares to two principals first, with internal allocation later, has a legitimate driver: Korea tightly regulates residents' cross-border share swaps. Each Korean shareholder must make foreign-exchange filings for foreign securities, and a share-for-share exchange is generally a TAXABLE DISPOSAL for Korean holders — tax is due in cash while the consideration arrives as shares, with no rollover relief for an exchange into a foreign parent. Dozens of individual filings and dry tax charges could stall the transaction. The question is therefore not whether to manage this, but which of the compliant paths to use.</w:t>
+      </w:r>
+    </w:p>
+    <w:tbl>
+      <w:tblPr>
+        <w:tblStyle w:val="LightGrid-Accent1"/>
+        <w:tblW w:type="auto" w:w="0"/>
+        <w:jc w:val="center"/>
+        <w:tblLook w:firstColumn="1" w:firstRow="1" w:lastColumn="0" w:lastRow="0" w:noHBand="0" w:noVBand="1" w:val="04A0"/>
+      </w:tblPr>
+      <w:tblGrid>
+        <w:gridCol w:w="2880"/>
+        <w:gridCol w:w="2880"/>
+        <w:gridCol w:w="2880"/>
+      </w:tblGrid>
+      <w:tr>
+        <w:tc>
+          <w:tcPr>
+            <w:tcW w:type="dxa" w:w="2448"/>
+          </w:tcPr>
+          <w:p>
+            <w:r>
+              <w:rPr>
+                <w:b/>
+                <w:sz w:val="19"/>
+              </w:rPr>
+              <w:t>Path</w:t>
+            </w:r>
+          </w:p>
+        </w:tc>
+        <w:tc>
+          <w:tcPr>
+            <w:tcW w:type="dxa" w:w="3888"/>
+          </w:tcPr>
+          <w:p>
+            <w:r>
+              <w:rPr>
+                <w:b/>
+                <w:sz w:val="19"/>
+              </w:rPr>
+              <w:t>Mechanics</w:t>
+            </w:r>
+          </w:p>
+        </w:tc>
+        <w:tc>
+          <w:tcPr>
+            <w:tcW w:type="dxa" w:w="3024"/>
+          </w:tcPr>
+          <w:p>
+            <w:r>
+              <w:rPr>
+                <w:b/>
+                <w:sz w:val="19"/>
+              </w:rPr>
+              <w:t>Assessment</w:t>
+            </w:r>
+          </w:p>
+        </w:tc>
+      </w:tr>
+      <w:tr>
+        <w:tc>
+          <w:tcPr>
+            <w:tcW w:type="dxa" w:w="2448"/>
+          </w:tcPr>
+          <w:p>
+            <w:r>
+              <w:rPr>
+                <w:b/>
+                <w:sz w:val="19"/>
+              </w:rPr>
+              <w:t>A. Direct swap by every Korean shareholder</w:t>
+            </w:r>
+          </w:p>
+        </w:tc>
+        <w:tc>
+          <w:tcPr>
+            <w:tcW w:type="dxa" w:w="3888"/>
+          </w:tcPr>
+          <w:p>
+            <w:r>
+              <w:rPr>
+                <w:sz w:val="19"/>
+              </w:rPr>
+              <w:t>Each holder files and is taxed individually at the exchange.</w:t>
+            </w:r>
+          </w:p>
+        </w:tc>
+        <w:tc>
+          <w:tcPr>
+            <w:tcW w:type="dxa" w:w="3024"/>
+          </w:tcPr>
+          <w:p>
+            <w:r>
+              <w:rPr>
+                <w:sz w:val="19"/>
+              </w:rPr>
+              <w:t>Heaviest friction — the problem the parties are rightly trying to avoid.</w:t>
+            </w:r>
+          </w:p>
+        </w:tc>
+      </w:tr>
+      <w:tr>
+        <w:tc>
+          <w:tcPr>
+            <w:tcW w:type="dxa" w:w="2448"/>
+          </w:tcPr>
+          <w:p>
+            <w:r>
+              <w:rPr>
+                <w:b/>
+                <w:sz w:val="19"/>
+              </w:rPr>
+              <w:t>B. Holdco block entry (recommended)</w:t>
+            </w:r>
+          </w:p>
+        </w:tc>
+        <w:tc>
+          <w:tcPr>
+            <w:tcW w:type="dxa" w:w="3888"/>
+          </w:tcPr>
+          <w:p>
+            <w:r>
+              <w:rPr>
+                <w:sz w:val="19"/>
+              </w:rPr>
+              <w:t>Korean shareholders exchange ONCE into GenApep Holdings at the low pre-listing value, with one collective FX filing handled by the FA; the later swap with the platform happens at holdco level — no second Korean-level tax/FX event.</w:t>
+            </w:r>
+          </w:p>
+        </w:tc>
+        <w:tc>
+          <w:tcPr>
+            <w:tcW w:type="dxa" w:w="3024"/>
+          </w:tcPr>
+          <w:p>
+            <w:r>
+              <w:rPr>
+                <w:sz w:val="19"/>
+              </w:rPr>
+              <w:t>Achieves the tax/FX objective AND automatic pro-rata fairness; this is what the Cayman structure exists for.</w:t>
+            </w:r>
+          </w:p>
+        </w:tc>
+      </w:tr>
+      <w:tr>
+        <w:tc>
+          <w:tcPr>
+            <w:tcW w:type="dxa" w:w="2448"/>
+          </w:tcPr>
+          <w:p>
+            <w:r>
+              <w:rPr>
+                <w:b/>
+                <w:sz w:val="19"/>
+              </w:rPr>
+              <w:t>C. Individuals hold first — documented</w:t>
+            </w:r>
+          </w:p>
+        </w:tc>
+        <w:tc>
+          <w:tcPr>
+            <w:tcW w:type="dxa" w:w="3888"/>
+          </w:tcPr>
+          <w:p>
+            <w:r>
+              <w:rPr>
+                <w:sz w:val="19"/>
+              </w:rPr>
+              <w:t>Written nominee/escrow declaration with the pro-rata allocation schedule annexed; transfer into the holdco by a fixed deadline AT THE SAME VALUATION (no gain, no gift); written Korean tax opinion on deemed-gift (myeongui-sintak) exposure; SEC beneficial-ownership disclosure from day one.</w:t>
+            </w:r>
+          </w:p>
+        </w:tc>
+        <w:tc>
+          <w:tcPr>
+            <w:tcW w:type="dxa" w:w="3024"/>
+          </w:tcPr>
+          <w:p>
+            <w:r>
+              <w:rPr>
+                <w:sz w:val="19"/>
+              </w:rPr>
+              <w:t>Workable as a bridge, but undocumented it creates deemed-gift tax, a larger second-step tax at post-listing values, disclosure defects, and personal risk for the two principals.</w:t>
+            </w:r>
+          </w:p>
+        </w:tc>
+      </w:tr>
+    </w:tbl>
+    <w:p>
+      <w:pPr>
+        <w:spacing w:after="40"/>
+      </w:pPr>
+    </w:p>
+    <w:p>
+      <w:pPr>
+        <w:spacing w:after="120"/>
+      </w:pPr>
+      <w:r>
+        <w:rPr>
+          <w:b w:val="0"/>
+          <w:i/>
+          <w:color w:val="555555"/>
+          <w:sz w:val="18"/>
+        </w:rPr>
+        <w:t>All Korean tax and FX statements require written confirmation by Korean counsel before any structure is selected.</w:t>
+      </w:r>
+    </w:p>
+    <w:p>
+      <w:pPr>
         <w:pStyle w:val="Heading2"/>
       </w:pPr>
       <w:r>
@@ -1337,10 +1560,10 @@
         <w:rPr>
           <w:b/>
         </w:rPr>
-        <w:t xml:space="preserve">What the draft IPO MOU would have done — </w:t>
+        <w:t xml:space="preserve">The draft IPO MOU's individual allocation — motive and fix — </w:t>
       </w:r>
       <w:r>
-        <w:t>It allocated 40% of FVH to one individual and 35% to another, with nothing to the wider WBI and Eyesel shareholder bodies at that step, and produced ~53:47 — reversing the agreed 51:49. Amendment A2 and Addendum clauses B4/B5 exist precisely to prevent this: every shareholder rides through pro rata or the transaction does not proceed.</w:t>
+        <w:t>It allocated 40% of FVH to one individual and 35% to another, with nothing to the wider shareholder bodies at that step, and produced ~53:47 against the agreed 51:49. The stated driver — avoiding Korean FX filings and dry tax charges on a direct swap — is legitimate (see the Korean tax paths in Section 4), but the arrangement must be documented and must land pro rata: Amendment A2 and Addendum B4/B5 require every shareholder to ride through pro rata — via the holdco block, or via a documented nominee bridge — protecting the wider holders and the two principals alike.</w:t>
       </w:r>
     </w:p>
     <w:p>

</xml_diff>

<commit_message>
Apply adversarial-verification fixes across the revised IPO documents
Verification workflow (4 agents) findings applied: pre-revenue framed
as DD-verified pending Form 1-K/1-SA confirmation wherever load-bearing;
~$0-2M labelled as assessed (not verified) value; $500K note terms
unverified; Route C per-share harmonized to $98-167; $11.4M relabelled
as JV-plan figure; Sidney Tam FA/Third-Director designations marked for
confirmation; briefing/deck as-pitched passages given inline SUPERSEDED
or RESOLVED markers (Eyesel data machinery closed out, gate-zero list
updated, cap-table scenarios marked, entity-name-chain footnote);
CN one-pager legacy-retention 20-25% corrected to verified-value basis,
GLP-1 synergy made conditional, DPW licence made prospective.

Co-Authored-By: Claude Fable 5 <noreply@anthropic.com>
Claude-Session: https://claude.ai/code/session_01AQEsBRx3YjneicK8t6qK39
</commit_message>
<xml_diff>
--- a/synexo/GenApep_Director_Briefing.docx
+++ b/synexo/GenApep_Director_Briefing.docx
@@ -73,7 +73,7 @@
           <w:color w:val="C0392B"/>
           <w:sz w:val="19"/>
         </w:rPr>
-        <w:t>SEPTEMBER 2026 UPDATE — READ FIRST. New evidence (Eyesel statutory FY2024/FY2025 financials; the FirstVitals DD report of 2026-09-03; the FirstVitals cap table of 2026-09-02) superseded parts of this briefing. Verified: FirstVitals is NOT an SEC reporting company (Reg A+ Form 1-A crowdfunding only), is pre-revenue after abandoning its RPM services in the 2024 pivot (the GLP-1 proforma is an unvalidated plan), is 94.63% owned by one holder with $500K lifetime capital and a 7.5M-share unissued option pool (54.18% fully diluted); its supportable value is ~$0-2M, not $5-13M. Eyesel FY2025 revenue is verified at ₩10.46B (~$7.47M @₩1,400) — inside the 15% equalisation band, closing the open item; the '~$15M Eyesel revenue' figure is contradicted. Route B is not viable as pitched; Route A remains default and a Korea listing is promoted to a parallel track. The governing document is now GenApep IPO Plan v2 (GenApep_IPO_Plan_v2.docx); passages below contradicted by it are retained for record only.</w:t>
+        <w:t>SEPTEMBER 2026 UPDATE — READ FIRST. New evidence (Eyesel statutory FY2024/FY2025 financials; the FirstVitals DD report of 2026-09-03; the FirstVitals cap table of 2026-09-02) superseded parts of this briefing. Verified: FirstVitals is NOT an SEC reporting company (Reg A+ Form 1-A crowdfunding only), is pre-revenue per the DD report (Form 1-K confirmation pending) after abandoning its RPM services in the 2024 pivot (the GLP-1 proforma is an unvalidated plan), is 94.63% owned by one holder with $500K lifetime capital and a 7.5M-share unissued option pool (54.18% fully diluted); its supportable value is ~$0-2M, not $5-13M. Eyesel FY2025 revenue is verified at ₩10.46B (~$7.47M @₩1,400) — inside the 15% equalisation band, closing the open item; the '~$15M Eyesel revenue' figure is contradicted. Route B is not viable as pitched; Route A remains default and a Korea listing is promoted to a parallel track. The governing document is now GenApep IPO Plan v2 (GenApep_IPO_Plan_v2.docx); passages below contradicted by it are retained for record only.</w:t>
       </w:r>
     </w:p>
     <w:p>
@@ -324,7 +324,7 @@
               <w:rPr>
                 <w:sz w:val="19"/>
               </w:rPr>
-              <w:t>Gate zero: obtain FVH's CIK and complete EDGAR filing index. Request July–August GLP-1 actual enrolments, claims submitted/paid and denial rates. No terms before verification.</w:t>
+              <w:t>Remaining gate-zero (Sep-2026 DD done): 1-A qualification status and amounts ACTUALLY sold; Form 1-K/1-SA cash-runway review; the $500K note's holder and terms; the entity-name chain (First Vital / FirstVitals / ProteusDx) to the 1-A filer. No terms before these report.</w:t>
             </w:r>
           </w:p>
         </w:tc>
@@ -604,7 +604,7 @@
               <w:rPr>
                 <w:sz w:val="19"/>
               </w:rPr>
-              <w:t>FVH's GLP-1 programme (US$2.2M 2026 → US$16.7M 2027 proforma; recurring MRR US$1.59M/month exiting 2027) and a US clinical channel for GenApep peptide products.</w:t>
+              <w:t>SUPERSEDED (Sep-2026): the GLP-1 proforma is an unvalidated plan of a DD-verified pre-revenue company (1-K confirmation pending); no operating channel verified.</w:t>
             </w:r>
           </w:p>
         </w:tc>
@@ -646,7 +646,7 @@
               <w:rPr>
                 <w:sz w:val="19"/>
               </w:rPr>
-              <w:t>FVH's SEC status is unverified; the GLP-1 programme has ~2 months of trading history; possible shell-company restrictions; inherited liabilities; related-party optics.</w:t>
+              <w:t>SEC status VERIFIED NEGATIVE (Reg A+ 1-A only, not a reporting company); the GLP-1 programme has NO trading history — pre-revenue per DD (1-K pending); possible shell restrictions; inherited liabilities; related-party optics.</w:t>
             </w:r>
           </w:p>
         </w:tc>
@@ -731,10 +731,10 @@
         <w:rPr>
           <w:b/>
         </w:rPr>
-        <w:t xml:space="preserve">Operating US clinical channel — </w:t>
+        <w:t xml:space="preserve">US clinical channel (CLAIMED) — </w:t>
       </w:r>
       <w:r>
-        <w:t>The GLP-1 patient base is a natural route to market for GenApep peptides — GI/metabolic support, muscle preservation, GLP-1-associated hair loss.</w:t>
+        <w:t>NOW CONTRADICTED: no operating channel or patient base exists — pre-revenue per DD; at best a future plan needing independent validation.</w:t>
       </w:r>
     </w:p>
     <w:p>
@@ -761,10 +761,10 @@
         <w:rPr>
           <w:b/>
         </w:rPr>
-        <w:t xml:space="preserve">US infrastructure &amp; shareholder base — </w:t>
+        <w:t xml:space="preserve">US infrastructure &amp; shareholder base (CLAIMED) — </w:t>
       </w:r>
       <w:r>
-        <w:t>Corporate platform and float that the JV would otherwise build from zero.</w:t>
+        <w:t>NOW CONTRADICTED: the verified cap table shows a 94.63% single holder plus eight small holders — no meaningful float; Reg A+ amounts actually sold unverified.</w:t>
       </w:r>
     </w:p>
     <w:p>
@@ -784,10 +784,10 @@
         <w:rPr>
           <w:b/>
         </w:rPr>
-        <w:t xml:space="preserve">Filing status unverified — </w:t>
+        <w:t xml:space="preserve">Filing status — </w:t>
       </w:r>
       <w:r>
-        <w:t>A public search did not surface an identifiable EDGAR record; if the Dec-2024 filing was a Reg-A offering statement, FVH may not be a reporting company at all. Gate zero.</w:t>
+        <w:t>RESOLVED (Sep-2026 DD): confirmed Reg A+ Form 1-A crowdfunding only — not a reporting company. Remaining gate-zero: 1-A qualification &amp; amounts sold, 1-K/1-SA runway, entity-name chain.</w:t>
       </w:r>
     </w:p>
     <w:p>
@@ -799,10 +799,10 @@
         <w:rPr>
           <w:b/>
         </w:rPr>
-        <w:t xml:space="preserve">Two months of trading history — </w:t>
+        <w:t xml:space="preserve">No trading history — </w:t>
       </w:r>
       <w:r>
-        <w:t>The GLP-1 programme began enrolling 1 July 2026; the 10,000-patient ramp is a plan, not a track record. July–August actuals are the cheapest diligence available.</w:t>
+        <w:t>SUPERSEDED: the claimed 1-July-2026 enrolment start was FVH's own narrative; DD verifies pre-revenue (1-K confirmation pending) — there are no programme actuals to request.</w:t>
       </w:r>
     </w:p>
     <w:p>
@@ -883,7 +883,7 @@
           <w:i w:val="0"/>
           <w:sz w:val="21"/>
         </w:rPr>
-        <w:t>First Vital's share structure is undetermined, which is an opportunity: the parties can set it rationally rather than inherit it. The recommendation is a single value-based exchange ratio: independent valuations of GenApep (planning range US$30–40M before technology upside) and of FVH (verified value — to be established in diligence), a written fairness opinion on the ratio, and entry as ONE block: FVH issues shares to GenApep Holdings' shareholders pro rata. The GenApep block percentage then divides internally at 51:49 less the sweat pool, automatically. No shares to individuals; no separate negotiations inside the FVH cap table; the draft IPO MOU's 40/35/25 allocation to two individuals is replaced.</w:t>
+        <w:t>[SEP-2026 UPDATE: the structure is now known — cap table of 2026-09-02: 6,341,625 shares, 94.63% one holder, 7.5M-share unissued pool = 54.18% fully diluted; the value-based method below stands, applied to the verified ~$0-2M value.] First Vital's share structure was undetermined, which is an opportunity: the parties can set it rationally rather than inherit it. The recommendation is a single value-based exchange ratio: independent valuations of GenApep (planning range US$30–40M before technology upside) and of FVH (verified value — to be established in diligence), a written fairness opinion on the ratio, and entry as ONE block: FVH issues shares to GenApep Holdings' shareholders pro rata. The GenApep block percentage then divides internally at 51:49 less the sweat pool, automatically. No shares to individuals; no separate negotiations inside the FVH cap table; the draft IPO MOU's 40/35/25 allocation to two individuals is replaced.</w:t>
       </w:r>
     </w:p>
     <w:p>
@@ -1559,10 +1559,10 @@
         <w:rPr>
           <w:b/>
         </w:rPr>
-        <w:t xml:space="preserve">Route B outcome (recommended structure) — </w:t>
+        <w:t xml:space="preserve">Route B outcome (SUPERSEDED — scenario retained for record) — </w:t>
       </w:r>
       <w:r>
-        <w:t>At FVH verified US$10M, WBI shareholders ≈ 35.3% of the listed company — ≈ US$15.9M at the US$45M combined value, and ≈ US$28–35M if the market values the group at US$80–100M. The GLP-1 channel adds a US revenue engine the JV does not otherwise have.</w:t>
+        <w:t>The 'FVH verified US$10M' scenario is now unsupportable (assessed supportable value ~$0–2M); there is no operating GLP-1 revenue engine (pre-revenue per DD, 1-K pending). At an honest ~$0–2M value with the pool cancelled, block entry keeps WBI shareholders near ~44% — but Route B is not viable as pitched; see IPO Plan v2.</w:t>
       </w:r>
     </w:p>
     <w:p>
@@ -1613,7 +1613,7 @@
           <w:i w:val="0"/>
           <w:sz w:val="21"/>
         </w:rPr>
-        <w:t>Eyesel's updated financial data is not yet available, and the 51:49 split rests on it. That does not block signing: fairness comes from mechanism, not from guessing the missing numbers. The four devices below let the parties commit now and correct automatically when the data arrives — the first is already drafted into Amendment No. 1.</w:t>
+        <w:t>[SEP-2026: Eyesel's statutory data has since ARRIVED (₩10.46B revenue, 47.8% GM, 17.6% OP margin) and the mechanisms below operated as designed — the variance sits inside the band. Section retained to show the machinery that now closes out.] At drafting, Eyesel's updated financial data was not yet available, and the 51:49 split rests on it. That does not block signing: fairness comes from mechanism, not from guessing the missing numbers. The four devices below let the parties commit now and correct automatically when the data arrives — the first is already drafted into Amendment No. 1.</w:t>
       </w:r>
     </w:p>
     <w:p>
@@ -2381,7 +2381,7 @@
           <w:color w:val="555555"/>
           <w:sz w:val="18"/>
         </w:rPr>
-        <w:t>Combined pre-JV valuation planning range US$30–40M (before AI.pep/DPW credit); illustrative IPO US$80M pre-money + US$20M primary raise. First Vital adds the GLP-1 line (US$2.2M → US$16.7M proforma) under Route B.</w:t>
+        <w:t>Combined pre-JV valuation planning range US$30–40M (before AI.pep/DPW credit); illustrative IPO US$80M pre-money + US$20M primary raise. The former First Vital GLP-1 line is excluded [SEP-2026: unvalidated plan of a pre-revenue company]; FY2025A column is JV-plan basis — verified statutory combined FY2025 ≈ $10.9M revenue @₩1,400.</w:t>
       </w:r>
     </w:p>
     <w:p>
@@ -2416,7 +2416,7 @@
         <w:spacing w:after="60"/>
       </w:pPr>
       <w:r>
-        <w:t>Instruct the FA to obtain FVH's CIK and complete EDGAR index, and July–August GLP-1 actuals — this week.</w:t>
+        <w:t>Complete the remaining FirstVitals gate-zero items this week: 1-A qualification &amp; amounts actually sold, 1-K/1-SA runway, the $500K note's holder/terms, entity-name chain to the 1-A filer (Reg A+ status itself now confirmed).</w:t>
       </w:r>
     </w:p>
     <w:p>
@@ -2425,7 +2425,7 @@
         <w:spacing w:after="60"/>
       </w:pPr>
       <w:r>
-        <w:t>Eyesel: deliver the updated financial report and confirm the principal — within 30 days.</w:t>
+        <w:t>Eyesel: financial report DELIVERED (statutory FY2025, verified Sep-2026); confirm the principal (Park vs Kim) in writing — within 30 days.</w:t>
       </w:r>
     </w:p>
     <w:p>

</xml_diff>